<commit_message>
feat: add odds watchlist and unify bet management for v0.14.0
</commit_message>
<xml_diff>
--- a/docs/Virtual Sportsbook - Governing Specification V1.docx
+++ b/docs/Virtual Sportsbook - Governing Specification V1.docx
@@ -7399,6 +7399,19 @@
         <w:rPr>
           <w:rtl w:val="0"/>
         </w:rPr>
+      </w:r>
+    </w:p>
+    <w:p>
+      <w:pPr>
+        <w:pStyle w:val="Heading2"/>
+      </w:pPr>
+      <w:r>
+        <w:t>Post-V1 v0.14.0 navigation amendment</w:t>
+      </w:r>
+    </w:p>
+    <w:p>
+      <w:r>
+        <w:t>The authenticated navigation adds Watchlist for watched pregame markets. My Bets now presents and manages simulated and imported/external wagers, including manual result entry for eligible imported wagers. Track Bet remains the create/import entry flow. The current interface may label these surfaces Browse Odds, Import Betslip, Analysis, and Lab Notes; Settings and authorized Admin navigation remain available.</w:t>
       </w:r>
     </w:p>
     <w:p>
@@ -11366,6 +11379,103 @@
         <w:rPr>
           <w:rtl w:val="0"/>
         </w:rPr>
+      </w:r>
+    </w:p>
+    <w:p>
+      <w:pPr>
+        <w:pStyle w:val="Heading1"/>
+      </w:pPr>
+      <w:r>
+        <w:t>30. Post-V1 Product Amendments</w:t>
+      </w:r>
+    </w:p>
+    <w:p>
+      <w:r>
+        <w:t>The following v0.14.0 requirements amend the original V1 product flow after its initial phased implementation. Sections 1 through 29 remain the historical V1 requirements. This release does not begin Phase 9 or add real-money wagering, a paid dependency, or a new provider polling path.</w:t>
+      </w:r>
+    </w:p>
+    <w:p>
+      <w:pPr>
+        <w:pStyle w:val="Heading2"/>
+      </w:pPr>
+      <w:r>
+        <w:t>30.1 v0.14.0 Odds Watchlist and Market Movement</w:t>
+      </w:r>
+    </w:p>
+    <w:p>
+      <w:r>
+        <w:t>The authenticated sportsbook offers Watch Odds on supported pregame selections. A watched selection shows Watching, and the authenticated navigation includes Watchlist. Watching records interest in a market; it is not a simulated wager or an external/IRL wager, does not reserve or guarantee a line or price, and creates no bankroll debit or credit.</w:t>
+      </w:r>
+    </w:p>
+    <w:p>
+      <w:r>
+        <w:t>A user's active watch is identified by the provider event, bookmaker, market, and normalized outcome or selection. A moving spread or total line remains the same underlying watched outcome. Duplicate active watches for one user are prevented; multiple users may independently watch the same market.</w:t>
+      </w:r>
+    </w:p>
+    <w:p>
+      <w:r>
+        <w:t>User-owned watch records are separate from one shared market odds-history dataset. Shared observations are captured only when fresh odds already arrive through the normal server-side provider, cache, refresh-lease, cooldown, and quota-ledger architecture. Starting or viewing a watch never triggers an extra provider request or user-specific polling.</w:t>
+      </w:r>
+    </w:p>
+    <w:p>
+      <w:r>
+        <w:t>The shared history records a meaningful first observation or a change in line or price; unchanged refreshes do not add redundant change points. Line movement and price movement are represented independently. Movement history may include observations from before a user started watching when the application genuinely captured them; missing prices are not inferred or backfilled.</w:t>
+      </w:r>
+    </w:p>
+    <w:p>
+      <w:r>
+        <w:t>The active Watchlist displays the event, start time, competition, bookmaker, market, selection, start and current line/price, separate line and price movement, watch time, latest odds refresh, and captured movement history. Add Current Odds to Bet Slip uses the current market state and retains server-authoritative fresh-price and stale-price validation. The immutable ticket snapshot begins only when the wager is submitted.</w:t>
+      </w:r>
+    </w:p>
+    <w:p>
+      <w:r>
+        <w:t>Watches never count as wagers and never affect wager totals, Vials, ROI, win percentage, performance analytics, or leaderboards. Watch records are user-authorized under Row Level Security; clients cannot mutate authoritative shared odds history.</w:t>
+      </w:r>
+    </w:p>
+    <w:p>
+      <w:r>
+        <w:t>When an event is known to be final/completed, cancelled, abandoned, void, or otherwise terminal under a supported provider state, its users' watches automatically clear from the active Watchlist through existing event, score, or settlement processing where practical. Repeated cleanup is safe. If a market disappears before game start, the watch is handled safely and the active UI shows only actionable pregame markets. Clearing watches does not delete shared odds history or require a separate high-frequency cleanup scheduler.</w:t>
+      </w:r>
+    </w:p>
+    <w:p>
+      <w:pPr>
+        <w:pStyle w:val="Heading2"/>
+      </w:pPr>
+      <w:r>
+        <w:t>30.2 v0.14.0 Unified My Bets Management</w:t>
+      </w:r>
+    </w:p>
+    <w:p>
+      <w:r>
+        <w:t>Track Bet is the entry and import workflow for a wager the user actually placed elsewhere, including its details and optional private screenshot. After creation, My Bets is the canonical place to view and manage both simulated and imported/IRL wagers. Source labels keep those separate systems of record clear; existing screenshot access remains authorized.</w:t>
+      </w:r>
+    </w:p>
+    <w:p>
+      <w:r>
+        <w:t>An imported wager requiring manual settlement is settled from its My Bets wager card or a compact interaction opened from that card. The supported existing result states are Won, Lost, Push, and Void, with the application's canonical result vocabulary and unchanged profit/loss meaning. Existing imported wagers remain manageable.</w:t>
+      </w:r>
+    </w:p>
+    <w:p>
+      <w:r>
+        <w:t>The redundant manual-settlement action is removed from the Track Bet/imported-bets page. My Bets retains practical source and open/settled filtering, with a responsive card layout showing relevant wager terms, status, and final profit/loss.</w:t>
+      </w:r>
+    </w:p>
+    <w:p>
+      <w:r>
+        <w:t>Only an authorized owner may settle or correct an imported wager. Result corrections retain append-only audit evidence and deterministic calculations. Imported settlement remains isolated from the simulated virtual bankroll and never creates a simulated bankroll-ledger entry. Direct database/API authorization must be tested, not inferred from hidden UI controls.</w:t>
+      </w:r>
+    </w:p>
+    <w:p>
+      <w:pPr>
+        <w:pStyle w:val="Heading2"/>
+      </w:pPr>
+      <w:r>
+        <w:t>30.3 Closing Line Value deferred</w:t>
+      </w:r>
+    </w:p>
+    <w:p>
+      <w:r>
+        <w:t>Closing Line Value (CLV) is added to the canonical product backlog and is not implemented in v0.14.0. Shared odds history is intentionally retained to support future analysis. Future CLV work must define reliable closing observations, line and price comparisons for spreads, totals, and moneylines, bookmaker-specific and possible consensus measures, user-level statistics, performance relationships, and behavior when no reliable close was captured. The CLV methodology must be defined and tested before exposing CLV numbers to users.</w:t>
       </w:r>
     </w:p>
     <w:sectPr>

</xml_diff>

<commit_message>
feat: release v0.15.0 browse odds UX improvements
</commit_message>
<xml_diff>
--- a/docs/Virtual Sportsbook - Governing Specification V1.docx
+++ b/docs/Virtual Sportsbook - Governing Specification V1.docx
@@ -11391,7 +11391,7 @@
     </w:p>
     <w:p>
       <w:r>
-        <w:t>The following v0.14.0 requirements amend the original V1 product flow after its initial phased implementation. Sections 1 through 29 remain the historical V1 requirements. This release does not begin Phase 9 or add real-money wagering, a paid dependency, or a new provider polling path.</w:t>
+        <w:t>The following v0.14.0 and v0.15.0 requirements amend the original V1 product flow after its initial phased implementation. Sections 1 through 29 remain the historical V1 requirements. This release does not begin Phase 9 or add real-money wagering, a paid dependency, or a new provider polling path.</w:t>
       </w:r>
     </w:p>
     <w:p>
@@ -11476,6 +11476,44 @@
     <w:p>
       <w:r>
         <w:t>Closing Line Value (CLV) is added to the canonical product backlog and is not implemented in v0.14.0. Shared odds history is intentionally retained to support future analysis. Future CLV work must define reliable closing observations, line and price comparisons for spreads, totals, and moneylines, bookmaker-specific and possible consensus measures, user-level statistics, performance relationships, and behavior when no reliable close was captured. The CLV methodology must be defined and tested before exposing CLV numbers to users.</w:t>
+      </w:r>
+    </w:p>
+    <w:p>
+      <w:pPr>
+        <w:pStyle w:val="Heading2"/>
+      </w:pPr>
+      <w:r>
+        <w:t>30.4 v0.15.0 Schedule-First Browse Odds</w:t>
+      </w:r>
+    </w:p>
+    <w:p>
+      <w:r>
+        <w:t>Browse Odds is a schedule-first view. Authenticated users select a supported competition and a display-timezone date, see only that day's games grouped chronologically by kickoff, and select one game to expose its complete supported market board. Compact game rows identify games without duplicating every bookmaker price for every event.</w:t>
+      </w:r>
+    </w:p>
+    <w:p>
+      <w:r>
+        <w:t>Jump to Game lists only the visible competition and date slate in the same deterministic order as the schedule. It uses canonical event IDs, selects the event, exposes its markets, and may scroll the event into view. Date and active-event query state may survive refresh and browser navigation; slip contents and price objects remain outside the URL.</w:t>
+      </w:r>
+    </w:p>
+    <w:p>
+      <w:r>
+        <w:t>Within an identical kickoff-time group, NCAAF silently prioritizes ranked versus ranked, then ranked versus unranked, then unranked conference games, then unranked non-conference games. Combined rank and best and second rank order ranked games. Rivalry, Power Four, reliable records, and winning percentage are secondary signals and never override the major hierarchy. The UI does not expose tiers, scores, or algorithm explanations.</w:t>
+      </w:r>
+    </w:p>
+    <w:p>
+      <w:r>
+        <w:t>The prioritization adapter is sport-aware. Domestic soccer can use reliable table positions and rivalry context within the same kickoff time; a qualifying slate may receive at most one subtle Marquee Matchup label. Tournament sports use only reliable context already available, and other sports fall back to stable deterministic ordering when context is missing.</w:t>
+      </w:r>
+    </w:p>
+    <w:p>
+      <w:r>
+        <w:t>Ranked college teams show the active ranking number immediately before the team name. Unranked teams show no NR marker. AP Top 25 is the current manually maintained zero-cost snapshot, sourced from the published AP poll at https://apnews.com/article/college-football-rankings-top-25-24005ba778fee95626d65d5deb5a18f8. CFP is supported as a dated source transition when a valid CFP snapshot is supplied. Standings, conference, record, and rivalry metadata are centralized, and missing metadata degrades safely.</w:t>
+      </w:r>
+    </w:p>
+    <w:p>
+      <w:r>
+        <w:t>Date changes, sorting, expansion, Jump to Game, and ranking presentation reuse the existing shared cache and do not independently request upstream odds. Existing straight and parlay selection state, stale-price checks, Watch Odds, alternate-line simulation, immutable snapshots, bankroll, settlement, analytics, RLS, and provider-secret boundaries remain unchanged. Desktop uses one coordinated sticky Bet Slip rail with controlled internal scrolling, while mobile uses its compact schedule and existing mobile slip controls without inheriting desktop rail stickiness. This release adds no database migration.</w:t>
       </w:r>
     </w:p>
     <w:sectPr>

</xml_diff>

<commit_message>
fix: correct v0.15.1 browse odds layout and timezone handling
</commit_message>
<xml_diff>
--- a/docs/Virtual Sportsbook - Governing Specification V1.docx
+++ b/docs/Virtual Sportsbook - Governing Specification V1.docx
@@ -11514,6 +11514,29 @@
     <w:p>
       <w:r>
         <w:t>Date changes, sorting, expansion, Jump to Game, and ranking presentation reuse the existing shared cache and do not independently request upstream odds. Existing straight and parlay selection state, stale-price checks, Watch Odds, alternate-line simulation, immutable snapshots, bankroll, settlement, analytics, RLS, and provider-secret boundaries remain unchanged. Desktop uses one coordinated sticky Bet Slip rail with controlled internal scrolling, while mobile uses its compact schedule and existing mobile slip controls without inheriting desktop rail stickiness. This release adds no database migration.</w:t>
+      </w:r>
+    </w:p>
+    <w:p>
+      <w:pPr>
+        <w:pStyle w:val="Heading3"/>
+      </w:pPr>
+      <w:r>
+        <w:t>30.5 v0.15.1 Browse Odds Corrective Patch</w:t>
+      </w:r>
+    </w:p>
+    <w:p>
+      <w:r>
+        <w:t>Browse date filtering, date labels, kickoff buckets, chronological ordering, Jump to Game labels, and Browse game cards use one timezone-normalized event datetime. The established Eastern Time Browse fallback is retained for profiles that still carry the historical UTC default; an explicit valid profile timezone remains respected. DST-aware timezone conversion is used without manual offset arithmetic or UTC string slicing.</w:t>
+      </w:r>
+    </w:p>
+    <w:p>
+      <w:r>
+        <w:t>Browse Odds starts with no selected event. A valid explicit event query may deep-link to a game; date changes and competition navigation clear ordinary active-event state. Jump to Game starts at a neutral placeholder and clicking a navigator row or selecting an option drives the same event ID.</w:t>
+      </w:r>
+    </w:p>
+    <w:p>
+      <w:r>
+        <w:t>Desktop/tablet-landscape Browse uses a compact Games navigator, one selected-game market detail region, and the coordinated Bet Slip rail. Mobile retains the single-column schedule with inline selected-game market expansion. The full market board is not rendered in every desktop schedule row.</w:t>
       </w:r>
     </w:p>
     <w:sectPr>

</xml_diff>

<commit_message>
feat: release v0.16.0 odds data architecture
</commit_message>
<xml_diff>
--- a/docs/Virtual Sportsbook - Governing Specification V1.docx
+++ b/docs/Virtual Sportsbook - Governing Specification V1.docx
@@ -11537,6 +11537,49 @@
     <w:p>
       <w:r>
         <w:t>Desktop/tablet-landscape Browse uses a compact Games navigator, one selected-game market detail region, and the coordinated Bet Slip rail. Mobile retains the single-column schedule with inline selected-game market expansion. The full market board is not rendered in every desktop schedule row.</w:t>
+      </w:r>
+    </w:p>
+    <w:p>
+      <w:pPr>
+        <w:pStyle w:val="Heading1"/>
+      </w:pPr>
+      <w:r>
+        <w:t>Approved v0.16.0 clarification 2026-09-28</w:t>
+      </w:r>
+    </w:p>
+    <w:p>
+      <w:r>
+        <w:t>The owner explicitly authorizes this forward-only odds-data architecture optimization after Phase 8. It does not start Phase 9, add real-money behavior, add a paid dependency, weaken RLS, change immutable submitted ticket terms, or enable player props, same-game parlays, live odds, or uncontrolled polling.</w:t>
+      </w:r>
+    </w:p>
+    <w:p>
+      <w:r>
+        <w:t>Pregame odds freshness is adaptive to the nearest upcoming event: target freshness is 24 hours when the event is more than seven days away, 6 hours in the week-out band, 2 hours in the day-out band, 30 minutes within six hours, and 10 minutes within one hour. Each shared cache row has a separate hard stale limit. Started and completed events are not refreshed as pregame odds, and stale rows fail closed after that limit.</w:t>
+      </w:r>
+    </w:p>
+    <w:p>
+      <w:r>
+        <w:t>A stale-but-usable shared row may be returned immediately while one lease-protected server refresh is scheduled with Next.js after(). The browser never polls the provider, provider failures never extend the hard stale limit, and the existing five-minute manual-refresh floor and quota conservation bands remain in force.</w:t>
+      </w:r>
+    </w:p>
+    <w:p>
+      <w:r>
+        <w:t>The default cost-safe bookmaker request pack is FanDuel, DraftKings, and BetRivers. BetMGM remains configurable but is not requested by default. Caesars remains configured as core coverage but is excluded from default requests because its current provider key is paid-only. Adding it to the free request pack requires a later provider-plan decision.</w:t>
+      </w:r>
+    </w:p>
+    <w:p>
+      <w:r>
+        <w:t>Odds movement history is pregame-only. Trusted captures include scheduled events strictly before kickoff and core bookmaker observations; event-catalog and alternate-line snapshots do not create shared pregame movement points. Existing post-start rows remain retained for audit and are marked non-pregame.</w:t>
+      </w:r>
+    </w:p>
+    <w:p>
+      <w:r>
+        <w:t>Provider telemetry records actual successful and failed attempts with requested markets, bookmakers, regions, provider event ID, refresh reason, cache state, lease state, attempts, response time, safe error metadata, HTTP status, and quota headers. Settlement and open-wager score refreshes pass target provider event IDs so competition-level score requests can skip unrelated future events while preserving the shared score cache and settlement idempotency.</w:t>
+      </w:r>
+    </w:p>
+    <w:p>
+      <w:r>
+        <w:t>The normalized provider model reserves optional provider market keys, participant IDs, scope, period, and variant fields for future dimensions without implementing new markets now.</w:t>
       </w:r>
     </w:p>
     <w:sectPr>

</xml_diff>